<commit_message>
Agrega DiaPago a contratos, documento de arquitectura y actualiza Prompts
Co-Authored-By: Claude Sonnet 5.5 <noreply@anthropic.com>
</commit_message>
<xml_diff>
--- a/Prompts/1_DefinicionProyecto.docx
+++ b/Prompts/1_DefinicionProyecto.docx
@@ -4,353 +4,402 @@
   <w:body>
     <w:p>
       <w:r>
-        <w:t xml:space="preserve">Contexto: Vamos a construir "Snap", un acortador de </w:t>
-      </w:r>
-      <w:proofErr w:type="spellStart"/>
-      <w:r>
-        <w:t>URLs</w:t>
-      </w:r>
-      <w:proofErr w:type="spellEnd"/>
+        <w:t xml:space="preserve">Contexto: Vamos a construir </w:t>
+      </w:r>
+      <w:r>
+        <w:t xml:space="preserve">una aplicación para gestión de contratos de alquiler de locales comerciales </w:t>
+      </w:r>
+      <w:r>
+        <w:t xml:space="preserve">con analíticas. </w:t>
+      </w:r>
     </w:p>
     <w:p>
       <w:r>
-        <w:t xml:space="preserve">con analíticas. Stack: .NET 10 + </w:t>
+        <w:t>Stack</w:t>
+      </w:r>
+      <w:r>
+        <w:t xml:space="preserve"> </w:t>
       </w:r>
       <w:proofErr w:type="spellStart"/>
       <w:r>
-        <w:t>Minimal</w:t>
+        <w:t>Backend</w:t>
       </w:r>
       <w:proofErr w:type="spellEnd"/>
       <w:r>
+        <w:t>: .NET 10</w:t>
+      </w:r>
+      <w:r>
+        <w:t>,</w:t>
+      </w:r>
+      <w:r>
+        <w:t xml:space="preserve"> API </w:t>
+      </w:r>
+      <w:proofErr w:type="spellStart"/>
+      <w:r>
+        <w:t>Controller</w:t>
+      </w:r>
+      <w:proofErr w:type="spellEnd"/>
+      <w:r>
+        <w:t>,</w:t>
+      </w:r>
+      <w:r>
+        <w:t xml:space="preserve"> C#,</w:t>
+      </w:r>
+      <w:r>
         <w:t xml:space="preserve"> </w:t>
       </w:r>
       <w:proofErr w:type="spellStart"/>
       <w:r>
-        <w:t>APIs</w:t>
+        <w:t>EntityFramework</w:t>
       </w:r>
       <w:proofErr w:type="spellEnd"/>
       <w:r>
-        <w:t xml:space="preserve"> + C#,</w:t>
+        <w:t xml:space="preserve">, </w:t>
+      </w:r>
+      <w:r>
+        <w:t>SQL</w:t>
+      </w:r>
+      <w:r>
+        <w:t xml:space="preserve"> Server 2019</w:t>
+      </w:r>
+      <w:r>
+        <w:t xml:space="preserve"> + </w:t>
+      </w:r>
+      <w:proofErr w:type="spellStart"/>
+      <w:proofErr w:type="gramStart"/>
+      <w:r>
+        <w:t>Microsoft.AspNetCore.Mvc.Testing</w:t>
+      </w:r>
+      <w:proofErr w:type="spellEnd"/>
+      <w:proofErr w:type="gramEnd"/>
+      <w:r>
+        <w:t xml:space="preserve"> para pruebas automáticas,</w:t>
       </w:r>
     </w:p>
     <w:p>
       <w:r>
-        <w:t xml:space="preserve">SQLite con better-sqlite3, </w:t>
+        <w:t xml:space="preserve">Stack </w:t>
       </w:r>
       <w:proofErr w:type="spellStart"/>
       <w:r>
-        <w:t>xUnit</w:t>
+        <w:t>Fontend</w:t>
       </w:r>
       <w:proofErr w:type="spellEnd"/>
       <w:r>
-        <w:t xml:space="preserve"> + </w:t>
+        <w:t>: Angular 21.</w:t>
+      </w:r>
+    </w:p>
+    <w:p>
+      <w:r>
+        <w:t xml:space="preserve">Tarea: </w:t>
+      </w:r>
+    </w:p>
+    <w:p>
+      <w:pPr>
+        <w:pStyle w:val="Prrafodelista"/>
+        <w:numPr>
+          <w:ilvl w:val="0"/>
+          <w:numId w:val="1"/>
+        </w:numPr>
+      </w:pPr>
+      <w:r>
+        <w:t xml:space="preserve">Lee el archivo que se encuentra </w:t>
       </w:r>
       <w:proofErr w:type="spellStart"/>
-      <w:proofErr w:type="gramStart"/>
-      <w:r>
-        <w:t>Microsoft.AspNetCore.Mvc.Testing</w:t>
+      <w:r>
+        <w:t>ScriptBD</w:t>
       </w:r>
       <w:proofErr w:type="spellEnd"/>
-      <w:proofErr w:type="gramEnd"/>
-      <w:r>
-        <w:t xml:space="preserve"> para pruebas automáticas,</w:t>
+      <w:r>
+        <w:t>\</w:t>
+      </w:r>
+      <w:proofErr w:type="spellStart"/>
+      <w:r>
+        <w:t>Tablas.sql</w:t>
+      </w:r>
+      <w:proofErr w:type="spellEnd"/>
+      <w:r>
+        <w:t>, analiza si las tablas que contiene son suficientes para la aplicación que se desea realizar.</w:t>
+      </w:r>
+    </w:p>
+    <w:p>
+      <w:pPr>
+        <w:pStyle w:val="Prrafodelista"/>
+        <w:numPr>
+          <w:ilvl w:val="0"/>
+          <w:numId w:val="1"/>
+        </w:numPr>
+      </w:pPr>
+      <w:r>
+        <w:t>Crea un repositorio en GitHub llamado “</w:t>
+      </w:r>
+      <w:proofErr w:type="spellStart"/>
+      <w:r>
+        <w:t>ProyectoIntegrador</w:t>
+      </w:r>
+      <w:proofErr w:type="spellEnd"/>
+      <w:r>
+        <w:t>” e i</w:t>
+      </w:r>
+      <w:r>
+        <w:t>nicializa la carpeta para que pueda enviarse los cambios a</w:t>
+      </w:r>
+      <w:r>
+        <w:t>l</w:t>
+      </w:r>
+      <w:r>
+        <w:t xml:space="preserve"> repositorio</w:t>
+      </w:r>
+      <w:r>
+        <w:t xml:space="preserve">, configura el </w:t>
+      </w:r>
+      <w:proofErr w:type="spellStart"/>
+      <w:r>
+        <w:t>readme</w:t>
+      </w:r>
+      <w:proofErr w:type="spellEnd"/>
+      <w:r>
+        <w:t>.</w:t>
+      </w:r>
+    </w:p>
+    <w:p>
+      <w:r>
+        <w:t>Restricciones:</w:t>
+      </w:r>
+    </w:p>
+    <w:p>
+      <w:r>
+        <w:t xml:space="preserve">- No </w:t>
+      </w:r>
+      <w:r>
+        <w:t>generes código ni modifiques el script.</w:t>
+      </w:r>
+    </w:p>
+    <w:p>
+      <w:r>
+        <w:t xml:space="preserve">Verificación: </w:t>
+      </w:r>
+      <w:r>
+        <w:t xml:space="preserve">Indícame si faltan tablas adicionales, si pudiste crear el repositorio en </w:t>
+      </w:r>
+      <w:proofErr w:type="spellStart"/>
+      <w:r>
+        <w:t>github</w:t>
+      </w:r>
+      <w:proofErr w:type="spellEnd"/>
+      <w:r>
+        <w:t xml:space="preserve">, </w:t>
+      </w:r>
+      <w:r>
+        <w:t>si te falta algún dato me informas.</w:t>
+      </w:r>
+    </w:p>
+    <w:p>
+      <w:r>
+        <w:drawing>
+          <wp:inline distT="0" distB="0" distL="0" distR="0" wp14:anchorId="0ED01AED" wp14:editId="27D894C2">
+            <wp:extent cx="5400040" cy="3302635"/>
+            <wp:effectExtent l="0" t="0" r="0" b="0"/>
+            <wp:docPr id="1772499418" name="Imagen 1"/>
+            <wp:cNvGraphicFramePr>
+              <a:graphicFrameLocks xmlns:a="http://schemas.openxmlformats.org/drawingml/2006/main" noChangeAspect="1"/>
+            </wp:cNvGraphicFramePr>
+            <a:graphic xmlns:a="http://schemas.openxmlformats.org/drawingml/2006/main">
+              <a:graphicData uri="http://schemas.openxmlformats.org/drawingml/2006/picture">
+                <pic:pic xmlns:pic="http://schemas.openxmlformats.org/drawingml/2006/picture">
+                  <pic:nvPicPr>
+                    <pic:cNvPr id="1772499418" name=""/>
+                    <pic:cNvPicPr/>
+                  </pic:nvPicPr>
+                  <pic:blipFill>
+                    <a:blip r:embed="rId5"/>
+                    <a:stretch>
+                      <a:fillRect/>
+                    </a:stretch>
+                  </pic:blipFill>
+                  <pic:spPr>
+                    <a:xfrm>
+                      <a:off x="0" y="0"/>
+                      <a:ext cx="5400040" cy="3302635"/>
+                    </a:xfrm>
+                    <a:prstGeom prst="rect">
+                      <a:avLst/>
+                    </a:prstGeom>
+                  </pic:spPr>
+                </pic:pic>
+              </a:graphicData>
+            </a:graphic>
+          </wp:inline>
+        </w:drawing>
+      </w:r>
+    </w:p>
+    <w:p>
+      <w:r>
+        <w:lastRenderedPageBreak/>
+        <w:drawing>
+          <wp:inline distT="0" distB="0" distL="0" distR="0" wp14:anchorId="746A6709" wp14:editId="63D10D6E">
+            <wp:extent cx="5400040" cy="2398395"/>
+            <wp:effectExtent l="0" t="0" r="0" b="1905"/>
+            <wp:docPr id="832396208" name="Imagen 1"/>
+            <wp:cNvGraphicFramePr>
+              <a:graphicFrameLocks xmlns:a="http://schemas.openxmlformats.org/drawingml/2006/main" noChangeAspect="1"/>
+            </wp:cNvGraphicFramePr>
+            <a:graphic xmlns:a="http://schemas.openxmlformats.org/drawingml/2006/main">
+              <a:graphicData uri="http://schemas.openxmlformats.org/drawingml/2006/picture">
+                <pic:pic xmlns:pic="http://schemas.openxmlformats.org/drawingml/2006/picture">
+                  <pic:nvPicPr>
+                    <pic:cNvPr id="832396208" name=""/>
+                    <pic:cNvPicPr/>
+                  </pic:nvPicPr>
+                  <pic:blipFill>
+                    <a:blip r:embed="rId6"/>
+                    <a:stretch>
+                      <a:fillRect/>
+                    </a:stretch>
+                  </pic:blipFill>
+                  <pic:spPr>
+                    <a:xfrm>
+                      <a:off x="0" y="0"/>
+                      <a:ext cx="5400040" cy="2398395"/>
+                    </a:xfrm>
+                    <a:prstGeom prst="rect">
+                      <a:avLst/>
+                    </a:prstGeom>
+                  </pic:spPr>
+                </pic:pic>
+              </a:graphicData>
+            </a:graphic>
+          </wp:inline>
+        </w:drawing>
+      </w:r>
+    </w:p>
+    <w:p>
+      <w:r>
+        <w:t>Verificación de repositorio en GitHub.</w:t>
+      </w:r>
+    </w:p>
+    <w:p>
+      <w:r>
+        <w:drawing>
+          <wp:inline distT="0" distB="0" distL="0" distR="0" wp14:anchorId="5494FCEF" wp14:editId="5CA29277">
+            <wp:extent cx="5400040" cy="2260600"/>
+            <wp:effectExtent l="0" t="0" r="0" b="6350"/>
+            <wp:docPr id="1029522461" name="Imagen 1"/>
+            <wp:cNvGraphicFramePr>
+              <a:graphicFrameLocks xmlns:a="http://schemas.openxmlformats.org/drawingml/2006/main" noChangeAspect="1"/>
+            </wp:cNvGraphicFramePr>
+            <a:graphic xmlns:a="http://schemas.openxmlformats.org/drawingml/2006/main">
+              <a:graphicData uri="http://schemas.openxmlformats.org/drawingml/2006/picture">
+                <pic:pic xmlns:pic="http://schemas.openxmlformats.org/drawingml/2006/picture">
+                  <pic:nvPicPr>
+                    <pic:cNvPr id="1029522461" name=""/>
+                    <pic:cNvPicPr/>
+                  </pic:nvPicPr>
+                  <pic:blipFill>
+                    <a:blip r:embed="rId7"/>
+                    <a:stretch>
+                      <a:fillRect/>
+                    </a:stretch>
+                  </pic:blipFill>
+                  <pic:spPr>
+                    <a:xfrm>
+                      <a:off x="0" y="0"/>
+                      <a:ext cx="5400040" cy="2260600"/>
+                    </a:xfrm>
+                    <a:prstGeom prst="rect">
+                      <a:avLst/>
+                    </a:prstGeom>
+                  </pic:spPr>
+                </pic:pic>
+              </a:graphicData>
+            </a:graphic>
+          </wp:inline>
+        </w:drawing>
+      </w:r>
+    </w:p>
+    <w:p>
+      <w:r>
+        <w:t>Modificación de script de base de datos.</w:t>
+      </w:r>
+    </w:p>
+    <w:p>
+      <w:r>
+        <w:drawing>
+          <wp:inline distT="0" distB="0" distL="0" distR="0" wp14:anchorId="19C98E46" wp14:editId="072BC60C">
+            <wp:extent cx="5400040" cy="1512570"/>
+            <wp:effectExtent l="0" t="0" r="0" b="0"/>
+            <wp:docPr id="873518702" name="Imagen 1"/>
+            <wp:cNvGraphicFramePr>
+              <a:graphicFrameLocks xmlns:a="http://schemas.openxmlformats.org/drawingml/2006/main" noChangeAspect="1"/>
+            </wp:cNvGraphicFramePr>
+            <a:graphic xmlns:a="http://schemas.openxmlformats.org/drawingml/2006/main">
+              <a:graphicData uri="http://schemas.openxmlformats.org/drawingml/2006/picture">
+                <pic:pic xmlns:pic="http://schemas.openxmlformats.org/drawingml/2006/picture">
+                  <pic:nvPicPr>
+                    <pic:cNvPr id="873518702" name=""/>
+                    <pic:cNvPicPr/>
+                  </pic:nvPicPr>
+                  <pic:blipFill>
+                    <a:blip r:embed="rId8"/>
+                    <a:stretch>
+                      <a:fillRect/>
+                    </a:stretch>
+                  </pic:blipFill>
+                  <pic:spPr>
+                    <a:xfrm>
+                      <a:off x="0" y="0"/>
+                      <a:ext cx="5400040" cy="1512570"/>
+                    </a:xfrm>
+                    <a:prstGeom prst="rect">
+                      <a:avLst/>
+                    </a:prstGeom>
+                  </pic:spPr>
+                </pic:pic>
+              </a:graphicData>
+            </a:graphic>
+          </wp:inline>
+        </w:drawing>
       </w:r>
     </w:p>
     <w:p/>
     <w:p>
       <w:r>
-        <w:t>Tarea: Inicializa el proyecto completo:</w:t>
-      </w:r>
-    </w:p>
-    <w:p>
-      <w:r>
-        <w:t>- Configura el archivo del proyecto (.</w:t>
-      </w:r>
-      <w:proofErr w:type="spellStart"/>
-      <w:r>
-        <w:t>csproj</w:t>
-      </w:r>
-      <w:proofErr w:type="spellEnd"/>
-      <w:r>
-        <w:t>) habilitando &lt;</w:t>
-      </w:r>
-      <w:proofErr w:type="spellStart"/>
-      <w:r>
-        <w:t>Nullable</w:t>
-      </w:r>
-      <w:proofErr w:type="spellEnd"/>
-      <w:r>
-        <w:t>&gt;</w:t>
-      </w:r>
-      <w:proofErr w:type="spellStart"/>
-      <w:r>
-        <w:t>enable</w:t>
-      </w:r>
-      <w:proofErr w:type="spellEnd"/>
-      <w:r>
-        <w:t>&lt;/</w:t>
-      </w:r>
-      <w:proofErr w:type="spellStart"/>
-      <w:r>
-        <w:t>Nullable</w:t>
-      </w:r>
-      <w:proofErr w:type="spellEnd"/>
-      <w:r>
-        <w:t>&gt; y &lt;</w:t>
-      </w:r>
-      <w:proofErr w:type="spellStart"/>
-      <w:r>
-        <w:t>ImplicitUsings</w:t>
-      </w:r>
-      <w:proofErr w:type="spellEnd"/>
-      <w:r>
-        <w:t>&gt;</w:t>
-      </w:r>
-      <w:proofErr w:type="spellStart"/>
-      <w:r>
-        <w:t>enable</w:t>
-      </w:r>
-      <w:proofErr w:type="spellEnd"/>
-      <w:r>
-        <w:t>&lt;/</w:t>
-      </w:r>
-      <w:proofErr w:type="spellStart"/>
-      <w:r>
-        <w:t>ImplicitUsings</w:t>
-      </w:r>
-      <w:proofErr w:type="spellEnd"/>
-      <w:r>
-        <w:t xml:space="preserve">&gt; para emular las directrices de </w:t>
-      </w:r>
-      <w:proofErr w:type="spellStart"/>
-      <w:r>
-        <w:t>TypeScript</w:t>
-      </w:r>
-      <w:proofErr w:type="spellEnd"/>
-      <w:r>
-        <w:t xml:space="preserve"> en modo estricto.</w:t>
-      </w:r>
-    </w:p>
-    <w:p>
-      <w:r>
-        <w:t>- Prepara el SDK de .NET para manejar los comandos de desarrollo (</w:t>
-      </w:r>
-      <w:proofErr w:type="spellStart"/>
-      <w:r>
-        <w:t>dotnet</w:t>
-      </w:r>
-      <w:proofErr w:type="spellEnd"/>
-      <w:r>
-        <w:t xml:space="preserve"> </w:t>
-      </w:r>
-      <w:proofErr w:type="spellStart"/>
-      <w:r>
-        <w:t>watch</w:t>
-      </w:r>
-      <w:proofErr w:type="spellEnd"/>
-      <w:r>
-        <w:t>), empaquetado (</w:t>
-      </w:r>
-      <w:proofErr w:type="spellStart"/>
-      <w:r>
-        <w:t>dotnet</w:t>
-      </w:r>
-      <w:proofErr w:type="spellEnd"/>
-      <w:r>
-        <w:t xml:space="preserve"> </w:t>
-      </w:r>
-      <w:proofErr w:type="spellStart"/>
-      <w:r>
-        <w:t>build</w:t>
-      </w:r>
-      <w:proofErr w:type="spellEnd"/>
-      <w:r>
-        <w:t>) y ejecución de pruebas (</w:t>
-      </w:r>
-      <w:proofErr w:type="spellStart"/>
-      <w:r>
-        <w:t>dotnet</w:t>
-      </w:r>
-      <w:proofErr w:type="spellEnd"/>
-      <w:r>
-        <w:t xml:space="preserve"> test).</w:t>
-      </w:r>
-    </w:p>
-    <w:p>
-      <w:r>
-        <w:t>- Crea la estructura de carpetas organizada de forma modular:</w:t>
-      </w:r>
-    </w:p>
-    <w:p>
-      <w:r>
-        <w:t xml:space="preserve">• </w:t>
-      </w:r>
-      <w:proofErr w:type="spellStart"/>
-      <w:r>
-        <w:t>src</w:t>
-      </w:r>
-      <w:proofErr w:type="spellEnd"/>
-      <w:r>
-        <w:t>/Data/ (Para inicialización de bases de datos y scripts SQL)</w:t>
-      </w:r>
-    </w:p>
-    <w:p>
-      <w:r>
-        <w:t xml:space="preserve">• </w:t>
-      </w:r>
-      <w:proofErr w:type="spellStart"/>
-      <w:r>
-        <w:t>src</w:t>
-      </w:r>
-      <w:proofErr w:type="spellEnd"/>
-      <w:r>
-        <w:t>/Modules/</w:t>
-      </w:r>
-      <w:proofErr w:type="spellStart"/>
-      <w:r>
-        <w:t>Urls</w:t>
-      </w:r>
-      <w:proofErr w:type="spellEnd"/>
-      <w:r>
-        <w:t>/</w:t>
-      </w:r>
-    </w:p>
-    <w:p>
-      <w:r>
-        <w:t xml:space="preserve">• </w:t>
-      </w:r>
-      <w:proofErr w:type="spellStart"/>
-      <w:r>
-        <w:t>src</w:t>
-      </w:r>
-      <w:proofErr w:type="spellEnd"/>
-      <w:r>
-        <w:t>/Modules/Auth/</w:t>
-      </w:r>
-    </w:p>
-    <w:p>
-      <w:r>
-        <w:t xml:space="preserve">• </w:t>
-      </w:r>
-      <w:proofErr w:type="spellStart"/>
-      <w:r>
-        <w:t>src</w:t>
-      </w:r>
-      <w:proofErr w:type="spellEnd"/>
-      <w:r>
-        <w:t>/Modules/</w:t>
-      </w:r>
-      <w:proofErr w:type="spellStart"/>
-      <w:r>
-        <w:t>Dashboard</w:t>
-      </w:r>
-      <w:proofErr w:type="spellEnd"/>
-      <w:r>
-        <w:t>/</w:t>
-      </w:r>
-    </w:p>
-    <w:p>
-      <w:r>
-        <w:t xml:space="preserve">- Implementa un servidor con </w:t>
-      </w:r>
-      <w:proofErr w:type="spellStart"/>
-      <w:r>
-        <w:t>Minimal</w:t>
-      </w:r>
-      <w:proofErr w:type="spellEnd"/>
-      <w:r>
-        <w:t xml:space="preserve"> </w:t>
-      </w:r>
-      <w:proofErr w:type="spellStart"/>
-      <w:r>
-        <w:t>APIs</w:t>
-      </w:r>
-      <w:proofErr w:type="spellEnd"/>
-      <w:r>
-        <w:t xml:space="preserve"> en el archivo </w:t>
-      </w:r>
-      <w:proofErr w:type="spellStart"/>
-      <w:r>
-        <w:t>Program.cs</w:t>
-      </w:r>
-      <w:proofErr w:type="spellEnd"/>
-      <w:r>
-        <w:t xml:space="preserve"> que exponga un </w:t>
-      </w:r>
-      <w:proofErr w:type="spellStart"/>
-      <w:r>
-        <w:t>endpoint</w:t>
-      </w:r>
-      <w:proofErr w:type="spellEnd"/>
-      <w:r>
-        <w:t xml:space="preserve"> GET /</w:t>
-      </w:r>
-      <w:proofErr w:type="spellStart"/>
-      <w:r>
-        <w:t>health</w:t>
-      </w:r>
-      <w:proofErr w:type="spellEnd"/>
-      <w:r>
-        <w:t xml:space="preserve"> que retorne un objeto JSON con el estado de salud de la aplicación.</w:t>
-      </w:r>
-    </w:p>
-    <w:p>
-      <w:r>
-        <w:t xml:space="preserve">- Añade </w:t>
-      </w:r>
-      <w:proofErr w:type="gramStart"/>
-      <w:r>
-        <w:t>un test</w:t>
-      </w:r>
-      <w:proofErr w:type="gramEnd"/>
-      <w:r>
-        <w:t xml:space="preserve"> básico que verifique que /</w:t>
-      </w:r>
-      <w:proofErr w:type="spellStart"/>
-      <w:r>
-        <w:t>health</w:t>
-      </w:r>
-      <w:proofErr w:type="spellEnd"/>
-      <w:r>
-        <w:t xml:space="preserve"> responde correctamente</w:t>
-      </w:r>
-    </w:p>
-    <w:p/>
-    <w:p>
-      <w:r>
-        <w:t>Restricciones:</w:t>
-      </w:r>
-    </w:p>
-    <w:p>
-      <w:r>
-        <w:t>- No uses ORMs, solo better-sqlite3 directo</w:t>
-      </w:r>
-    </w:p>
-    <w:p>
-      <w:r>
-        <w:t>- No instales dependencias que no sean necesarias ahora</w:t>
-      </w:r>
-    </w:p>
-    <w:p/>
-    <w:p>
-      <w:r>
-        <w:t xml:space="preserve">Verificación: Al terminar ejecuta el </w:t>
-      </w:r>
-      <w:proofErr w:type="spellStart"/>
-      <w:r>
-        <w:t>build</w:t>
-      </w:r>
-      <w:proofErr w:type="spellEnd"/>
-      <w:r>
-        <w:t xml:space="preserve"> y los </w:t>
-      </w:r>
-      <w:proofErr w:type="spellStart"/>
-      <w:r>
-        <w:t>tests</w:t>
-      </w:r>
-      <w:proofErr w:type="spellEnd"/>
-      <w:r>
-        <w:t>.</w:t>
+        <w:lastRenderedPageBreak/>
+        <w:drawing>
+          <wp:inline distT="0" distB="0" distL="0" distR="0" wp14:anchorId="0843574D" wp14:editId="41AD6DFB">
+            <wp:extent cx="5400040" cy="2082800"/>
+            <wp:effectExtent l="0" t="0" r="0" b="0"/>
+            <wp:docPr id="794054027" name="Imagen 1"/>
+            <wp:cNvGraphicFramePr>
+              <a:graphicFrameLocks xmlns:a="http://schemas.openxmlformats.org/drawingml/2006/main" noChangeAspect="1"/>
+            </wp:cNvGraphicFramePr>
+            <a:graphic xmlns:a="http://schemas.openxmlformats.org/drawingml/2006/main">
+              <a:graphicData uri="http://schemas.openxmlformats.org/drawingml/2006/picture">
+                <pic:pic xmlns:pic="http://schemas.openxmlformats.org/drawingml/2006/picture">
+                  <pic:nvPicPr>
+                    <pic:cNvPr id="794054027" name=""/>
+                    <pic:cNvPicPr/>
+                  </pic:nvPicPr>
+                  <pic:blipFill>
+                    <a:blip r:embed="rId9"/>
+                    <a:stretch>
+                      <a:fillRect/>
+                    </a:stretch>
+                  </pic:blipFill>
+                  <pic:spPr>
+                    <a:xfrm>
+                      <a:off x="0" y="0"/>
+                      <a:ext cx="5400040" cy="2082800"/>
+                    </a:xfrm>
+                    <a:prstGeom prst="rect">
+                      <a:avLst/>
+                    </a:prstGeom>
+                  </pic:spPr>
+                </pic:pic>
+              </a:graphicData>
+            </a:graphic>
+          </wp:inline>
+        </w:drawing>
       </w:r>
     </w:p>
     <w:sectPr>
@@ -361,6 +410,126 @@
     </w:sectPr>
   </w:body>
 </w:document>
+</file>
+
+<file path=word/numbering.xml><?xml version="1.0" encoding="utf-8"?>
+<w:numbering xmlns:wpc="http://schemas.microsoft.com/office/word/2010/wordprocessingCanvas" xmlns:cx="http://schemas.microsoft.com/office/drawing/2014/chartex" xmlns:cx1="http://schemas.microsoft.com/office/drawing/2015/9/8/chartex" xmlns:cx2="http://schemas.microsoft.com/office/drawing/2015/10/21/chartex" xmlns:cx3="http://schemas.microsoft.com/office/drawing/2016/5/9/chartex" xmlns:cx4="http://schemas.microsoft.com/office/drawing/2016/5/10/chartex" xmlns:cx5="http://schemas.microsoft.com/office/drawing/2016/5/11/chartex" xmlns:cx6="http://schemas.microsoft.com/office/drawing/2016/5/12/chartex" xmlns:cx7="http://schemas.microsoft.com/office/drawing/2016/5/13/chartex" xmlns:cx8="http://schemas.microsoft.com/office/drawing/2016/5/14/chartex" xmlns:mc="http://schemas.openxmlformats.org/markup-compatibility/2006" xmlns:aink="http://schemas.microsoft.com/office/drawing/2016/ink" xmlns:am3d="http://schemas.microsoft.com/office/drawing/2017/model3d" xmlns:o="urn:schemas-microsoft-com:office:office" xmlns:oel="http://schemas.microsoft.com/office/2019/extlst" xmlns:r="http://schemas.openxmlformats.org/officeDocument/2006/relationships" xmlns:m="http://schemas.openxmlformats.org/officeDocument/2006/math" xmlns:v="urn:schemas-microsoft-com:vml" xmlns:wp14="http://schemas.microsoft.com/office/word/2010/wordprocessingDrawing" xmlns:wp="http://schemas.openxmlformats.org/drawingml/2006/wordprocessingDrawing" xmlns:w10="urn:schemas-microsoft-com:office:word" xmlns:w="http://schemas.openxmlformats.org/wordprocessingml/2006/main" xmlns:w14="http://schemas.microsoft.com/office/word/2010/wordml" xmlns:w15="http://schemas.microsoft.com/office/word/2012/wordml" xmlns:w16cex="http://schemas.microsoft.com/office/word/2018/wordml/cex" xmlns:w16cid="http://schemas.microsoft.com/office/word/2016/wordml/cid" xmlns:w16="http://schemas.microsoft.com/office/word/2018/wordml" xmlns:w16du="http://schemas.microsoft.com/office/word/2023/wordml/word16du" xmlns:w16sdtdh="http://schemas.microsoft.com/office/word/2020/wordml/sdtdatahash" xmlns:w16sdtfl="http://schemas.microsoft.com/office/word/2024/wordml/sdtformatlock" xmlns:w16se="http://schemas.microsoft.com/office/word/2015/wordml/symex" xmlns:wpg="http://schemas.microsoft.com/office/word/2010/wordprocessingGroup" xmlns:wpi="http://schemas.microsoft.com/office/word/2010/wordprocessingInk" xmlns:wne="http://schemas.microsoft.com/office/word/2006/wordml" xmlns:wps="http://schemas.microsoft.com/office/word/2010/wordprocessingShape" mc:Ignorable="w14 w15 w16se w16cid w16 w16cex w16sdtdh w16sdtfl w16du wp14">
+  <w:abstractNum w:abstractNumId="0" w15:restartNumberingAfterBreak="0">
+    <w:nsid w:val="53C315B9"/>
+    <w:multiLevelType w:val="hybridMultilevel"/>
+    <w:tmpl w:val="BD40DAC2"/>
+    <w:lvl w:ilvl="0" w:tplc="7F9637A2">
+      <w:numFmt w:val="bullet"/>
+      <w:lvlText w:val="-"/>
+      <w:lvlJc w:val="left"/>
+      <w:pPr>
+        <w:ind w:left="720" w:hanging="360"/>
+      </w:pPr>
+      <w:rPr>
+        <w:rFonts w:ascii="Aptos" w:eastAsiaTheme="minorHAnsi" w:hAnsi="Aptos" w:cstheme="minorBidi" w:hint="default"/>
+      </w:rPr>
+    </w:lvl>
+    <w:lvl w:ilvl="1" w:tplc="280A0003" w:tentative="1">
+      <w:start w:val="1"/>
+      <w:numFmt w:val="bullet"/>
+      <w:lvlText w:val="o"/>
+      <w:lvlJc w:val="left"/>
+      <w:pPr>
+        <w:ind w:left="1440" w:hanging="360"/>
+      </w:pPr>
+      <w:rPr>
+        <w:rFonts w:ascii="Courier New" w:hAnsi="Courier New" w:cs="Courier New" w:hint="default"/>
+      </w:rPr>
+    </w:lvl>
+    <w:lvl w:ilvl="2" w:tplc="280A0005" w:tentative="1">
+      <w:start w:val="1"/>
+      <w:numFmt w:val="bullet"/>
+      <w:lvlText w:val=""/>
+      <w:lvlJc w:val="left"/>
+      <w:pPr>
+        <w:ind w:left="2160" w:hanging="360"/>
+      </w:pPr>
+      <w:rPr>
+        <w:rFonts w:ascii="Wingdings" w:hAnsi="Wingdings" w:hint="default"/>
+      </w:rPr>
+    </w:lvl>
+    <w:lvl w:ilvl="3" w:tplc="280A0001" w:tentative="1">
+      <w:start w:val="1"/>
+      <w:numFmt w:val="bullet"/>
+      <w:lvlText w:val=""/>
+      <w:lvlJc w:val="left"/>
+      <w:pPr>
+        <w:ind w:left="2880" w:hanging="360"/>
+      </w:pPr>
+      <w:rPr>
+        <w:rFonts w:ascii="Symbol" w:hAnsi="Symbol" w:hint="default"/>
+      </w:rPr>
+    </w:lvl>
+    <w:lvl w:ilvl="4" w:tplc="280A0003" w:tentative="1">
+      <w:start w:val="1"/>
+      <w:numFmt w:val="bullet"/>
+      <w:lvlText w:val="o"/>
+      <w:lvlJc w:val="left"/>
+      <w:pPr>
+        <w:ind w:left="3600" w:hanging="360"/>
+      </w:pPr>
+      <w:rPr>
+        <w:rFonts w:ascii="Courier New" w:hAnsi="Courier New" w:cs="Courier New" w:hint="default"/>
+      </w:rPr>
+    </w:lvl>
+    <w:lvl w:ilvl="5" w:tplc="280A0005" w:tentative="1">
+      <w:start w:val="1"/>
+      <w:numFmt w:val="bullet"/>
+      <w:lvlText w:val=""/>
+      <w:lvlJc w:val="left"/>
+      <w:pPr>
+        <w:ind w:left="4320" w:hanging="360"/>
+      </w:pPr>
+      <w:rPr>
+        <w:rFonts w:ascii="Wingdings" w:hAnsi="Wingdings" w:hint="default"/>
+      </w:rPr>
+    </w:lvl>
+    <w:lvl w:ilvl="6" w:tplc="280A0001" w:tentative="1">
+      <w:start w:val="1"/>
+      <w:numFmt w:val="bullet"/>
+      <w:lvlText w:val=""/>
+      <w:lvlJc w:val="left"/>
+      <w:pPr>
+        <w:ind w:left="5040" w:hanging="360"/>
+      </w:pPr>
+      <w:rPr>
+        <w:rFonts w:ascii="Symbol" w:hAnsi="Symbol" w:hint="default"/>
+      </w:rPr>
+    </w:lvl>
+    <w:lvl w:ilvl="7" w:tplc="280A0003" w:tentative="1">
+      <w:start w:val="1"/>
+      <w:numFmt w:val="bullet"/>
+      <w:lvlText w:val="o"/>
+      <w:lvlJc w:val="left"/>
+      <w:pPr>
+        <w:ind w:left="5760" w:hanging="360"/>
+      </w:pPr>
+      <w:rPr>
+        <w:rFonts w:ascii="Courier New" w:hAnsi="Courier New" w:cs="Courier New" w:hint="default"/>
+      </w:rPr>
+    </w:lvl>
+    <w:lvl w:ilvl="8" w:tplc="280A0005" w:tentative="1">
+      <w:start w:val="1"/>
+      <w:numFmt w:val="bullet"/>
+      <w:lvlText w:val=""/>
+      <w:lvlJc w:val="left"/>
+      <w:pPr>
+        <w:ind w:left="6480" w:hanging="360"/>
+      </w:pPr>
+      <w:rPr>
+        <w:rFonts w:ascii="Wingdings" w:hAnsi="Wingdings" w:hint="default"/>
+      </w:rPr>
+    </w:lvl>
+  </w:abstractNum>
+  <w:num w:numId="1" w16cid:durableId="2020811372">
+    <w:abstractNumId w:val="0"/>
+  </w:num>
+</w:numbering>
 </file>
 
 <file path=word/styles.xml><?xml version="1.0" encoding="utf-8"?>

</xml_diff>